<commit_message>
Revision made on 11/07/2024
</commit_message>
<xml_diff>
--- a/Revision/Figures/Figure 1.docx
+++ b/Revision/Figures/Figure 1.docx
@@ -3,15 +3,18 @@
 <w:document xmlns:wpc="http://schemas.microsoft.com/office/word/2010/wordprocessingCanvas" xmlns:cx="http://schemas.microsoft.com/office/drawing/2014/chartex" xmlns:cx1="http://schemas.microsoft.com/office/drawing/2015/9/8/chartex" xmlns:cx2="http://schemas.microsoft.com/office/drawing/2015/10/21/chartex" xmlns:cx3="http://schemas.microsoft.com/office/drawing/2016/5/9/chartex" xmlns:cx4="http://schemas.microsoft.com/office/drawing/2016/5/10/chartex" xmlns:cx5="http://schemas.microsoft.com/office/drawing/2016/5/11/chartex" xmlns:cx6="http://schemas.microsoft.com/office/drawing/2016/5/12/chartex" xmlns:cx7="http://schemas.microsoft.com/office/drawing/2016/5/13/chartex" xmlns:cx8="http://schemas.microsoft.com/office/drawing/2016/5/14/chartex" xmlns:mc="http://schemas.openxmlformats.org/markup-compatibility/2006" xmlns:aink="http://schemas.microsoft.com/office/drawing/2016/ink" xmlns:am3d="http://schemas.microsoft.com/office/drawing/2017/model3d" xmlns:o="urn:schemas-microsoft-com:office:office" xmlns:oel="http://schemas.microsoft.com/office/2019/extlst" xmlns:r="http://schemas.openxmlformats.org/officeDocument/2006/relationships" xmlns:m="http://schemas.openxmlformats.org/officeDocument/2006/math" xmlns:v="urn:schemas-microsoft-com:vml" xmlns:wp14="http://schemas.microsoft.com/office/word/2010/wordprocessingDrawing" xmlns:wp="http://schemas.openxmlformats.org/drawingml/2006/wordprocessingDrawing" xmlns:w10="urn:schemas-microsoft-com:office:word" xmlns:w="http://schemas.openxmlformats.org/wordprocessingml/2006/main" xmlns:w14="http://schemas.microsoft.com/office/word/2010/wordml" xmlns:w15="http://schemas.microsoft.com/office/word/2012/wordml" xmlns:w16cex="http://schemas.microsoft.com/office/word/2018/wordml/cex" xmlns:w16cid="http://schemas.microsoft.com/office/word/2016/wordml/cid" xmlns:w16="http://schemas.microsoft.com/office/word/2018/wordml" xmlns:w16du="http://schemas.microsoft.com/office/word/2023/wordml/word16du" xmlns:w16sdtdh="http://schemas.microsoft.com/office/word/2020/wordml/sdtdatahash" xmlns:w16se="http://schemas.microsoft.com/office/word/2015/wordml/symex" xmlns:wpg="http://schemas.microsoft.com/office/word/2010/wordprocessingGroup" xmlns:wpi="http://schemas.microsoft.com/office/word/2010/wordprocessingInk" xmlns:wne="http://schemas.microsoft.com/office/word/2006/wordml" xmlns:wps="http://schemas.microsoft.com/office/word/2010/wordprocessingShape" mc:Ignorable="w14 w15 w16se w16cid w16 w16cex w16sdtdh w16du wp14">
   <w:body>
     <w:p>
+      <w:pPr>
+        <w:jc w:val="both"/>
+      </w:pPr>
       <w:r>
         <w:rPr>
           <w:noProof/>
         </w:rPr>
         <w:drawing>
-          <wp:inline distT="0" distB="0" distL="0" distR="0" wp14:anchorId="5A6C2664" wp14:editId="10A1151E">
-            <wp:extent cx="8582677" cy="5129244"/>
-            <wp:effectExtent l="0" t="0" r="8890" b="0"/>
-            <wp:docPr id="228942667" name="Picture 1"/>
+          <wp:inline distT="0" distB="0" distL="0" distR="0" wp14:anchorId="5401F368" wp14:editId="2816C26E">
+            <wp:extent cx="5780002" cy="6172200"/>
+            <wp:effectExtent l="0" t="0" r="0" b="0"/>
+            <wp:docPr id="1034902704" name="Picture 1"/>
             <wp:cNvGraphicFramePr>
               <a:graphicFrameLocks xmlns:a="http://schemas.openxmlformats.org/drawingml/2006/main" noChangeAspect="1"/>
             </wp:cNvGraphicFramePr>
@@ -19,7 +22,7 @@
               <a:graphicData uri="http://schemas.openxmlformats.org/drawingml/2006/picture">
                 <pic:pic xmlns:pic="http://schemas.openxmlformats.org/drawingml/2006/picture">
                   <pic:nvPicPr>
-                    <pic:cNvPr id="228942667" name="Picture 1"/>
+                    <pic:cNvPr id="1034902704" name="Picture 1"/>
                     <pic:cNvPicPr/>
                   </pic:nvPicPr>
                   <pic:blipFill>
@@ -37,7 +40,7 @@
                   <pic:spPr>
                     <a:xfrm>
                       <a:off x="0" y="0"/>
-                      <a:ext cx="8588251" cy="5132575"/>
+                      <a:ext cx="5800182" cy="6193749"/>
                     </a:xfrm>
                     <a:prstGeom prst="rect">
                       <a:avLst/>
@@ -52,190 +55,56 @@
     </w:p>
     <w:p>
       <w:pPr>
+        <w:pStyle w:val="Caption"/>
         <w:spacing w:line="480" w:lineRule="auto"/>
         <w:jc w:val="both"/>
         <w:rPr>
           <w:rFonts w:ascii="Arial" w:hAnsi="Arial" w:cs="Arial"/>
-          <w:noProof/>
-          <w:color w:val="000000" w:themeColor="text1"/>
         </w:rPr>
       </w:pPr>
       <w:r>
         <w:rPr>
           <w:rFonts w:ascii="Arial" w:hAnsi="Arial" w:cs="Arial"/>
-          <w:color w:val="000000" w:themeColor="text1"/>
+          <w:i w:val="0"/>
+          <w:iCs w:val="0"/>
+          <w:color w:val="auto"/>
+          <w:sz w:val="22"/>
+          <w:szCs w:val="22"/>
         </w:rPr>
-        <w:lastRenderedPageBreak/>
         <w:t xml:space="preserve">Figure </w:t>
-      </w:r>
-      <w:del w:id="0" w:author="Man Lim Ho" w:date="2024-07-08T15:52:00Z" w16du:dateUtc="2024-07-08T05:52:00Z">
-        <w:r>
-          <w:rPr>
-            <w:rFonts w:ascii="Arial" w:hAnsi="Arial" w:cs="Arial"/>
-            <w:color w:val="000000" w:themeColor="text1"/>
-          </w:rPr>
-          <w:delText>3</w:delText>
-        </w:r>
-        <w:r>
-          <w:rPr>
-            <w:rFonts w:ascii="Arial" w:hAnsi="Arial" w:cs="Arial"/>
-            <w:color w:val="000000" w:themeColor="text1"/>
-          </w:rPr>
-          <w:delText xml:space="preserve"> </w:delText>
-        </w:r>
-      </w:del>
-      <w:ins w:id="1" w:author="Man Lim Ho" w:date="2024-07-08T15:52:00Z" w16du:dateUtc="2024-07-08T05:52:00Z">
-        <w:r>
-          <w:rPr>
-            <w:rFonts w:ascii="Arial" w:hAnsi="Arial" w:cs="Arial"/>
-            <w:color w:val="000000" w:themeColor="text1"/>
-          </w:rPr>
-          <w:t>1</w:t>
-        </w:r>
-        <w:r>
-          <w:rPr>
-            <w:rFonts w:ascii="Arial" w:hAnsi="Arial" w:cs="Arial"/>
-            <w:color w:val="000000" w:themeColor="text1"/>
-          </w:rPr>
-          <w:t xml:space="preserve"> </w:t>
-        </w:r>
-      </w:ins>
-      <w:r>
-        <w:rPr>
-          <w:rFonts w:ascii="Arial" w:hAnsi="Arial" w:cs="Arial"/>
-          <w:color w:val="000000" w:themeColor="text1"/>
-        </w:rPr>
-        <w:t>Map showing tropical ecoregions (Yellow), subtropical ecoregions</w:t>
       </w:r>
       <w:r>
         <w:rPr>
           <w:rFonts w:ascii="Arial" w:hAnsi="Arial" w:cs="Arial"/>
-          <w:noProof/>
-          <w:color w:val="000000" w:themeColor="text1"/>
+          <w:i w:val="0"/>
+          <w:iCs w:val="0"/>
+          <w:color w:val="auto"/>
+          <w:sz w:val="22"/>
+          <w:szCs w:val="22"/>
         </w:rPr>
-        <w:t xml:space="preserve"> (Green), temperate ecoregions (Blue) and arctic ecoregions (Light Blue)</w:t>
+        <w:t>1</w:t>
       </w:r>
-      <w:del w:id="2" w:author="Man Lim Ho" w:date="2024-06-25T11:07:00Z" w16du:dateUtc="2024-06-25T01:07:00Z">
-        <w:r>
-          <w:rPr>
-            <w:rFonts w:ascii="Arial" w:hAnsi="Arial" w:cs="Arial"/>
-            <w:noProof/>
-            <w:color w:val="000000" w:themeColor="text1"/>
-          </w:rPr>
-          <w:delText>, created using R package leaflet.</w:delText>
-        </w:r>
-      </w:del>
-      <w:ins w:id="3" w:author="Man Lim Ho" w:date="2024-06-25T11:07:00Z" w16du:dateUtc="2024-06-25T01:07:00Z">
-        <w:r>
-          <w:rPr>
-            <w:rFonts w:ascii="Arial" w:hAnsi="Arial" w:cs="Arial"/>
-            <w:noProof/>
-            <w:color w:val="000000" w:themeColor="text1"/>
-          </w:rPr>
-          <w:t>.</w:t>
-        </w:r>
-      </w:ins>
-      <w:ins w:id="4" w:author="Man Lim Ho" w:date="2024-07-02T14:02:00Z" w16du:dateUtc="2024-07-02T04:02:00Z">
-        <w:r>
-          <w:rPr>
-            <w:rFonts w:ascii="Arial" w:hAnsi="Arial" w:cs="Arial"/>
-            <w:noProof/>
-            <w:color w:val="000000" w:themeColor="text1"/>
-          </w:rPr>
-          <w:t xml:space="preserve"> The grey area between 20°S and 40°S to the left side of the figure is </w:t>
-        </w:r>
-      </w:ins>
-      <w:ins w:id="5" w:author="Man Lim Ho" w:date="2024-07-02T14:03:00Z" w16du:dateUtc="2024-07-02T04:03:00Z">
-        <w:r>
-          <w:rPr>
-            <w:rFonts w:ascii="Arial" w:hAnsi="Arial" w:cs="Arial"/>
-            <w:noProof/>
-            <w:color w:val="000000" w:themeColor="text1"/>
-          </w:rPr>
-          <w:t xml:space="preserve">the </w:t>
-        </w:r>
-      </w:ins>
-      <w:ins w:id="6" w:author="Man Lim Ho" w:date="2024-07-02T14:04:00Z" w16du:dateUtc="2024-07-02T04:04:00Z">
-        <w:r>
-          <w:rPr>
-            <w:rFonts w:ascii="Arial" w:hAnsi="Arial" w:cs="Arial"/>
-            <w:noProof/>
-            <w:color w:val="000000" w:themeColor="text1"/>
-          </w:rPr>
-          <w:t xml:space="preserve">Easter Island, where </w:t>
-        </w:r>
-        <w:r>
-          <w:rPr>
-            <w:rFonts w:ascii="Arial" w:hAnsi="Arial" w:cs="Arial"/>
-            <w:noProof/>
-            <w:color w:val="000000" w:themeColor="text1"/>
-          </w:rPr>
-          <w:t xml:space="preserve">both tropical and subtropical </w:t>
-        </w:r>
-      </w:ins>
-      <w:ins w:id="7" w:author="Man Lim Ho" w:date="2024-07-02T14:05:00Z" w16du:dateUtc="2024-07-02T04:05:00Z">
-        <w:r>
-          <w:rPr>
-            <w:rFonts w:ascii="Arial" w:hAnsi="Arial" w:cs="Arial"/>
-            <w:noProof/>
-            <w:color w:val="000000" w:themeColor="text1"/>
-          </w:rPr>
-          <w:t xml:space="preserve">ecoregions can be found </w:t>
-        </w:r>
-        <w:r>
-          <w:rPr>
-            <w:rFonts w:ascii="Arial" w:hAnsi="Arial" w:cs="Arial"/>
-            <w:noProof/>
-            <w:color w:val="000000" w:themeColor="text1"/>
-          </w:rPr>
-          <w:t>[</w:t>
-        </w:r>
-      </w:ins>
-      <w:ins w:id="8" w:author="Man Lim Ho" w:date="2024-07-02T14:06:00Z" w16du:dateUtc="2024-07-02T04:06:00Z">
-        <w:r>
-          <w:rPr>
-            <w:rFonts w:ascii="Arial" w:hAnsi="Arial" w:cs="Arial"/>
-            <w:noProof/>
-            <w:color w:val="000000" w:themeColor="text1"/>
-          </w:rPr>
-          <w:t>23</w:t>
-        </w:r>
-      </w:ins>
-      <w:ins w:id="9" w:author="Man Lim Ho" w:date="2024-07-02T14:05:00Z" w16du:dateUtc="2024-07-02T04:05:00Z">
-        <w:r>
-          <w:rPr>
-            <w:rFonts w:ascii="Arial" w:hAnsi="Arial" w:cs="Arial"/>
-            <w:noProof/>
-            <w:color w:val="000000" w:themeColor="text1"/>
-          </w:rPr>
-          <w:t>]</w:t>
-        </w:r>
-        <w:r>
-          <w:rPr>
-            <w:rFonts w:ascii="Arial" w:hAnsi="Arial" w:cs="Arial"/>
-            <w:noProof/>
-            <w:color w:val="000000" w:themeColor="text1"/>
-          </w:rPr>
-          <w:t>.</w:t>
-        </w:r>
-      </w:ins>
+      <w:r>
+        <w:rPr>
+          <w:rFonts w:ascii="Arial" w:hAnsi="Arial" w:cs="Arial"/>
+          <w:i w:val="0"/>
+          <w:iCs w:val="0"/>
+          <w:color w:val="auto"/>
+          <w:sz w:val="22"/>
+          <w:szCs w:val="22"/>
+        </w:rPr>
+        <w:t xml:space="preserve"> Flow diagram of this systematic map, detailing the process of removal literature per stage. Created with ROSES reporting flow diagram tool.</w:t>
+      </w:r>
     </w:p>
+    <w:p/>
     <w:sectPr>
-      <w:pgSz w:w="16838" w:h="11906" w:orient="landscape"/>
+      <w:pgSz w:w="11906" w:h="16838"/>
       <w:pgMar w:top="1440" w:right="1440" w:bottom="1440" w:left="1440" w:header="720" w:footer="720" w:gutter="0"/>
       <w:cols w:space="720"/>
       <w:docGrid w:linePitch="360"/>
     </w:sectPr>
   </w:body>
 </w:document>
-</file>
-
-<file path=word/people.xml><?xml version="1.0" encoding="utf-8"?>
-<w15:people xmlns:wpc="http://schemas.microsoft.com/office/word/2010/wordprocessingCanvas" xmlns:cx="http://schemas.microsoft.com/office/drawing/2014/chartex" xmlns:cx1="http://schemas.microsoft.com/office/drawing/2015/9/8/chartex" xmlns:cx2="http://schemas.microsoft.com/office/drawing/2015/10/21/chartex" xmlns:cx3="http://schemas.microsoft.com/office/drawing/2016/5/9/chartex" xmlns:cx4="http://schemas.microsoft.com/office/drawing/2016/5/10/chartex" xmlns:cx5="http://schemas.microsoft.com/office/drawing/2016/5/11/chartex" xmlns:cx6="http://schemas.microsoft.com/office/drawing/2016/5/12/chartex" xmlns:cx7="http://schemas.microsoft.com/office/drawing/2016/5/13/chartex" xmlns:cx8="http://schemas.microsoft.com/office/drawing/2016/5/14/chartex" xmlns:mc="http://schemas.openxmlformats.org/markup-compatibility/2006" xmlns:aink="http://schemas.microsoft.com/office/drawing/2016/ink" xmlns:am3d="http://schemas.microsoft.com/office/drawing/2017/model3d" xmlns:o="urn:schemas-microsoft-com:office:office" xmlns:oel="http://schemas.microsoft.com/office/2019/extlst" xmlns:r="http://schemas.openxmlformats.org/officeDocument/2006/relationships" xmlns:m="http://schemas.openxmlformats.org/officeDocument/2006/math" xmlns:v="urn:schemas-microsoft-com:vml" xmlns:wp14="http://schemas.microsoft.com/office/word/2010/wordprocessingDrawing" xmlns:wp="http://schemas.openxmlformats.org/drawingml/2006/wordprocessingDrawing" xmlns:w10="urn:schemas-microsoft-com:office:word" xmlns:w="http://schemas.openxmlformats.org/wordprocessingml/2006/main" xmlns:w14="http://schemas.microsoft.com/office/word/2010/wordml" xmlns:w15="http://schemas.microsoft.com/office/word/2012/wordml" xmlns:w16cex="http://schemas.microsoft.com/office/word/2018/wordml/cex" xmlns:w16cid="http://schemas.microsoft.com/office/word/2016/wordml/cid" xmlns:w16="http://schemas.microsoft.com/office/word/2018/wordml" xmlns:w16du="http://schemas.microsoft.com/office/word/2023/wordml/word16du" xmlns:w16sdtdh="http://schemas.microsoft.com/office/word/2020/wordml/sdtdatahash" xmlns:w16se="http://schemas.microsoft.com/office/word/2015/wordml/symex" xmlns:wpg="http://schemas.microsoft.com/office/word/2010/wordprocessingGroup" xmlns:wpi="http://schemas.microsoft.com/office/word/2010/wordprocessingInk" xmlns:wne="http://schemas.microsoft.com/office/word/2006/wordml" xmlns:wps="http://schemas.microsoft.com/office/word/2010/wordprocessingShape" mc:Ignorable="w14 w15 w16se w16cid w16 w16cex w16sdtdh w16du wp14">
-  <w15:person w15:author="Man Lim Ho">
-    <w15:presenceInfo w15:providerId="AD" w15:userId="S::z3489017@ad.unsw.edu.au::d478686e-be09-41cb-9a63-8a1a2ea93f42"/>
-  </w15:person>
-</w15:people>
 </file>
 
 <file path=word/styles.xml><?xml version="1.0" encoding="utf-8"?>
@@ -646,7 +515,7 @@
     <w:link w:val="Heading1Char"/>
     <w:uiPriority w:val="9"/>
     <w:qFormat/>
-    <w:rsid w:val="007E4206"/>
+    <w:rsid w:val="009D2423"/>
     <w:pPr>
       <w:keepNext/>
       <w:keepLines/>
@@ -669,7 +538,7 @@
     <w:semiHidden/>
     <w:unhideWhenUsed/>
     <w:qFormat/>
-    <w:rsid w:val="007E4206"/>
+    <w:rsid w:val="009D2423"/>
     <w:pPr>
       <w:keepNext/>
       <w:keepLines/>
@@ -692,7 +561,7 @@
     <w:semiHidden/>
     <w:unhideWhenUsed/>
     <w:qFormat/>
-    <w:rsid w:val="007E4206"/>
+    <w:rsid w:val="009D2423"/>
     <w:pPr>
       <w:keepNext/>
       <w:keepLines/>
@@ -715,7 +584,7 @@
     <w:semiHidden/>
     <w:unhideWhenUsed/>
     <w:qFormat/>
-    <w:rsid w:val="007E4206"/>
+    <w:rsid w:val="009D2423"/>
     <w:pPr>
       <w:keepNext/>
       <w:keepLines/>
@@ -738,7 +607,7 @@
     <w:semiHidden/>
     <w:unhideWhenUsed/>
     <w:qFormat/>
-    <w:rsid w:val="007E4206"/>
+    <w:rsid w:val="009D2423"/>
     <w:pPr>
       <w:keepNext/>
       <w:keepLines/>
@@ -759,7 +628,7 @@
     <w:semiHidden/>
     <w:unhideWhenUsed/>
     <w:qFormat/>
-    <w:rsid w:val="007E4206"/>
+    <w:rsid w:val="009D2423"/>
     <w:pPr>
       <w:keepNext/>
       <w:keepLines/>
@@ -782,7 +651,7 @@
     <w:semiHidden/>
     <w:unhideWhenUsed/>
     <w:qFormat/>
-    <w:rsid w:val="007E4206"/>
+    <w:rsid w:val="009D2423"/>
     <w:pPr>
       <w:keepNext/>
       <w:keepLines/>
@@ -803,7 +672,7 @@
     <w:semiHidden/>
     <w:unhideWhenUsed/>
     <w:qFormat/>
-    <w:rsid w:val="007E4206"/>
+    <w:rsid w:val="009D2423"/>
     <w:pPr>
       <w:keepNext/>
       <w:keepLines/>
@@ -826,7 +695,7 @@
     <w:semiHidden/>
     <w:unhideWhenUsed/>
     <w:qFormat/>
-    <w:rsid w:val="007E4206"/>
+    <w:rsid w:val="009D2423"/>
     <w:pPr>
       <w:keepNext/>
       <w:keepLines/>
@@ -870,7 +739,7 @@
     <w:basedOn w:val="DefaultParagraphFont"/>
     <w:link w:val="Heading1"/>
     <w:uiPriority w:val="9"/>
-    <w:rsid w:val="007E4206"/>
+    <w:rsid w:val="009D2423"/>
     <w:rPr>
       <w:rFonts w:asciiTheme="majorHAnsi" w:eastAsiaTheme="majorEastAsia" w:hAnsiTheme="majorHAnsi" w:cstheme="majorBidi"/>
       <w:color w:val="0F4761" w:themeColor="accent1" w:themeShade="BF"/>
@@ -884,7 +753,7 @@
     <w:link w:val="Heading2"/>
     <w:uiPriority w:val="9"/>
     <w:semiHidden/>
-    <w:rsid w:val="007E4206"/>
+    <w:rsid w:val="009D2423"/>
     <w:rPr>
       <w:rFonts w:asciiTheme="majorHAnsi" w:eastAsiaTheme="majorEastAsia" w:hAnsiTheme="majorHAnsi" w:cstheme="majorBidi"/>
       <w:color w:val="0F4761" w:themeColor="accent1" w:themeShade="BF"/>
@@ -898,7 +767,7 @@
     <w:link w:val="Heading3"/>
     <w:uiPriority w:val="9"/>
     <w:semiHidden/>
-    <w:rsid w:val="007E4206"/>
+    <w:rsid w:val="009D2423"/>
     <w:rPr>
       <w:rFonts w:eastAsiaTheme="majorEastAsia" w:cstheme="majorBidi"/>
       <w:color w:val="0F4761" w:themeColor="accent1" w:themeShade="BF"/>
@@ -912,7 +781,7 @@
     <w:link w:val="Heading4"/>
     <w:uiPriority w:val="9"/>
     <w:semiHidden/>
-    <w:rsid w:val="007E4206"/>
+    <w:rsid w:val="009D2423"/>
     <w:rPr>
       <w:rFonts w:eastAsiaTheme="majorEastAsia" w:cstheme="majorBidi"/>
       <w:i/>
@@ -926,7 +795,7 @@
     <w:link w:val="Heading5"/>
     <w:uiPriority w:val="9"/>
     <w:semiHidden/>
-    <w:rsid w:val="007E4206"/>
+    <w:rsid w:val="009D2423"/>
     <w:rPr>
       <w:rFonts w:eastAsiaTheme="majorEastAsia" w:cstheme="majorBidi"/>
       <w:color w:val="0F4761" w:themeColor="accent1" w:themeShade="BF"/>
@@ -938,7 +807,7 @@
     <w:link w:val="Heading6"/>
     <w:uiPriority w:val="9"/>
     <w:semiHidden/>
-    <w:rsid w:val="007E4206"/>
+    <w:rsid w:val="009D2423"/>
     <w:rPr>
       <w:rFonts w:eastAsiaTheme="majorEastAsia" w:cstheme="majorBidi"/>
       <w:i/>
@@ -952,7 +821,7 @@
     <w:link w:val="Heading7"/>
     <w:uiPriority w:val="9"/>
     <w:semiHidden/>
-    <w:rsid w:val="007E4206"/>
+    <w:rsid w:val="009D2423"/>
     <w:rPr>
       <w:rFonts w:eastAsiaTheme="majorEastAsia" w:cstheme="majorBidi"/>
       <w:color w:val="595959" w:themeColor="text1" w:themeTint="A6"/>
@@ -964,7 +833,7 @@
     <w:link w:val="Heading8"/>
     <w:uiPriority w:val="9"/>
     <w:semiHidden/>
-    <w:rsid w:val="007E4206"/>
+    <w:rsid w:val="009D2423"/>
     <w:rPr>
       <w:rFonts w:eastAsiaTheme="majorEastAsia" w:cstheme="majorBidi"/>
       <w:i/>
@@ -978,7 +847,7 @@
     <w:link w:val="Heading9"/>
     <w:uiPriority w:val="9"/>
     <w:semiHidden/>
-    <w:rsid w:val="007E4206"/>
+    <w:rsid w:val="009D2423"/>
     <w:rPr>
       <w:rFonts w:eastAsiaTheme="majorEastAsia" w:cstheme="majorBidi"/>
       <w:color w:val="272727" w:themeColor="text1" w:themeTint="D8"/>
@@ -991,7 +860,7 @@
     <w:link w:val="TitleChar"/>
     <w:uiPriority w:val="10"/>
     <w:qFormat/>
-    <w:rsid w:val="007E4206"/>
+    <w:rsid w:val="009D2423"/>
     <w:pPr>
       <w:spacing w:after="80" w:line="240" w:lineRule="auto"/>
       <w:contextualSpacing/>
@@ -1009,7 +878,7 @@
     <w:basedOn w:val="DefaultParagraphFont"/>
     <w:link w:val="Title"/>
     <w:uiPriority w:val="10"/>
-    <w:rsid w:val="007E4206"/>
+    <w:rsid w:val="009D2423"/>
     <w:rPr>
       <w:rFonts w:asciiTheme="majorHAnsi" w:eastAsiaTheme="majorEastAsia" w:hAnsiTheme="majorHAnsi" w:cstheme="majorBidi"/>
       <w:spacing w:val="-10"/>
@@ -1025,7 +894,7 @@
     <w:link w:val="SubtitleChar"/>
     <w:uiPriority w:val="11"/>
     <w:qFormat/>
-    <w:rsid w:val="007E4206"/>
+    <w:rsid w:val="009D2423"/>
     <w:pPr>
       <w:numPr>
         <w:ilvl w:val="1"/>
@@ -1044,7 +913,7 @@
     <w:basedOn w:val="DefaultParagraphFont"/>
     <w:link w:val="Subtitle"/>
     <w:uiPriority w:val="11"/>
-    <w:rsid w:val="007E4206"/>
+    <w:rsid w:val="009D2423"/>
     <w:rPr>
       <w:rFonts w:eastAsiaTheme="majorEastAsia" w:cstheme="majorBidi"/>
       <w:color w:val="595959" w:themeColor="text1" w:themeTint="A6"/>
@@ -1060,7 +929,7 @@
     <w:link w:val="QuoteChar"/>
     <w:uiPriority w:val="29"/>
     <w:qFormat/>
-    <w:rsid w:val="007E4206"/>
+    <w:rsid w:val="009D2423"/>
     <w:pPr>
       <w:spacing w:before="160"/>
       <w:jc w:val="center"/>
@@ -1076,7 +945,7 @@
     <w:basedOn w:val="DefaultParagraphFont"/>
     <w:link w:val="Quote"/>
     <w:uiPriority w:val="29"/>
-    <w:rsid w:val="007E4206"/>
+    <w:rsid w:val="009D2423"/>
     <w:rPr>
       <w:i/>
       <w:iCs/>
@@ -1088,7 +957,7 @@
     <w:basedOn w:val="Normal"/>
     <w:uiPriority w:val="34"/>
     <w:qFormat/>
-    <w:rsid w:val="007E4206"/>
+    <w:rsid w:val="009D2423"/>
     <w:pPr>
       <w:ind w:left="720"/>
       <w:contextualSpacing/>
@@ -1099,7 +968,7 @@
     <w:basedOn w:val="DefaultParagraphFont"/>
     <w:uiPriority w:val="21"/>
     <w:qFormat/>
-    <w:rsid w:val="007E4206"/>
+    <w:rsid w:val="009D2423"/>
     <w:rPr>
       <w:i/>
       <w:iCs/>
@@ -1113,7 +982,7 @@
     <w:link w:val="IntenseQuoteChar"/>
     <w:uiPriority w:val="30"/>
     <w:qFormat/>
-    <w:rsid w:val="007E4206"/>
+    <w:rsid w:val="009D2423"/>
     <w:pPr>
       <w:pBdr>
         <w:top w:val="single" w:sz="4" w:space="10" w:color="0F4761" w:themeColor="accent1" w:themeShade="BF"/>
@@ -1134,7 +1003,7 @@
     <w:basedOn w:val="DefaultParagraphFont"/>
     <w:link w:val="IntenseQuote"/>
     <w:uiPriority w:val="30"/>
-    <w:rsid w:val="007E4206"/>
+    <w:rsid w:val="009D2423"/>
     <w:rPr>
       <w:i/>
       <w:iCs/>
@@ -1146,7 +1015,7 @@
     <w:basedOn w:val="DefaultParagraphFont"/>
     <w:uiPriority w:val="32"/>
     <w:qFormat/>
-    <w:rsid w:val="007E4206"/>
+    <w:rsid w:val="009D2423"/>
     <w:rPr>
       <w:b/>
       <w:bCs/>
@@ -1155,15 +1024,24 @@
       <w:spacing w:val="5"/>
     </w:rPr>
   </w:style>
-  <w:style w:type="paragraph" w:styleId="Revision">
-    <w:name w:val="Revision"/>
-    <w:hidden/>
-    <w:uiPriority w:val="99"/>
-    <w:semiHidden/>
-    <w:rsid w:val="008C07F4"/>
-    <w:pPr>
-      <w:spacing w:after="0" w:line="240" w:lineRule="auto"/>
-    </w:pPr>
+  <w:style w:type="paragraph" w:styleId="Caption">
+    <w:name w:val="caption"/>
+    <w:basedOn w:val="Normal"/>
+    <w:next w:val="Normal"/>
+    <w:uiPriority w:val="35"/>
+    <w:unhideWhenUsed/>
+    <w:qFormat/>
+    <w:rsid w:val="009D2423"/>
+    <w:pPr>
+      <w:spacing w:after="200" w:line="240" w:lineRule="auto"/>
+    </w:pPr>
+    <w:rPr>
+      <w:i/>
+      <w:iCs/>
+      <w:color w:val="0E2841" w:themeColor="text2"/>
+      <w:sz w:val="18"/>
+      <w:szCs w:val="18"/>
+    </w:rPr>
   </w:style>
 </w:styles>
 </file>

</xml_diff>